<commit_message>
Add QR code reader functionality and enhance notifications for status changes
</commit_message>
<xml_diff>
--- a/Documentacao/DocFINAL_SenaiGMP_.docx
+++ b/Documentacao/DocFINAL_SenaiGMP_.docx
@@ -4,6 +4,7 @@
   <w:body>
     <w:p>
       <w:pPr>
+        <w:ind w:left="-283"/>
         <w:jc w:val="center"/>
       </w:pPr>
       <w:r>
@@ -27,7 +28,7 @@
             <v:path o:extrusionok="f" gradientshapeok="t" o:connecttype="rect"/>
             <o:lock v:ext="edit" aspectratio="t"/>
           </v:shapetype>
-          <v:shape id="_x0000_i1025" type="#_x0000_t75" style="width:789.75pt;height:1117.5pt;mso-position-horizontal:left;mso-position-horizontal-relative:char;mso-position-vertical:top;mso-position-vertical-relative:line">
+          <v:shape id="_x0000_i1025" type="#_x0000_t75" style="width:593.6pt;height:841.4pt;mso-position-horizontal:left;mso-position-horizontal-relative:char;mso-position-vertical:top;mso-position-vertical-relative:line">
             <v:imagedata r:id="rId5" o:title=""/>
           </v:shape>
         </w:pict>
@@ -37,7 +38,7 @@
       <w:pPr>
         <w:sectPr>
           <w:pgSz w:w="11905" w:h="16837"/>
-          <w:pgMar w:top="283" w:right="283" w:bottom="283" w:left="283" w:header="720" w:footer="720" w:gutter="0"/>
+          <w:pgMar w:top="0" w:right="283" w:bottom="283" w:left="283" w:header="720" w:footer="720" w:gutter="0"/>
           <w:cols w:space="720"/>
         </w:sectPr>
       </w:pPr>
@@ -10035,7 +10036,7 @@
       </w:pPr>
       <w:r>
         <w:pict w14:anchorId="5FD8E768">
-          <v:shape id="_x0000_i1026" type="#_x0000_t75" style="width:489pt;height:322.5pt;mso-position-horizontal:left;mso-position-horizontal-relative:char;mso-position-vertical:top;mso-position-vertical-relative:line">
+          <v:shape id="_x0000_i1026" type="#_x0000_t75" style="width:488.95pt;height:323.15pt;mso-position-horizontal:left;mso-position-horizontal-relative:char;mso-position-vertical:top;mso-position-vertical-relative:line">
             <v:imagedata r:id="rId6" o:title=""/>
           </v:shape>
         </w:pict>
@@ -18939,7 +18940,7 @@
       <w:r>
         <w:lastRenderedPageBreak/>
         <w:pict w14:anchorId="1F326DCE">
-          <v:shape id="_x0000_i1027" type="#_x0000_t75" style="width:374.25pt;height:582.75pt;mso-position-horizontal:left;mso-position-horizontal-relative:char;mso-position-vertical:top;mso-position-vertical-relative:line">
+          <v:shape id="_x0000_i1027" type="#_x0000_t75" style="width:374.25pt;height:582.7pt;mso-position-horizontal:left;mso-position-horizontal-relative:char;mso-position-vertical:top;mso-position-vertical-relative:line">
             <v:imagedata r:id="rId7" o:title=""/>
           </v:shape>
         </w:pict>
@@ -19004,7 +19005,7 @@
       <w:r>
         <w:lastRenderedPageBreak/>
         <w:pict w14:anchorId="6CAB3653">
-          <v:shape id="_x0000_i1028" type="#_x0000_t75" style="width:444.75pt;height:593.25pt;mso-position-horizontal:left;mso-position-horizontal-relative:char;mso-position-vertical:top;mso-position-vertical-relative:line">
+          <v:shape id="_x0000_i1028" type="#_x0000_t75" style="width:444.55pt;height:592.75pt;mso-position-horizontal:left;mso-position-horizontal-relative:char;mso-position-vertical:top;mso-position-vertical-relative:line">
             <v:imagedata r:id="rId8" o:title=""/>
           </v:shape>
         </w:pict>
@@ -19069,7 +19070,7 @@
       </w:pPr>
       <w:r>
         <w:pict w14:anchorId="7F4FFAB8">
-          <v:shape id="_x0000_i1029" type="#_x0000_t75" style="width:388.5pt;height:249.75pt;mso-position-horizontal:left;mso-position-horizontal-relative:char;mso-position-vertical:top;mso-position-vertical-relative:line">
+          <v:shape id="_x0000_i1029" type="#_x0000_t75" style="width:388.45pt;height:249.5pt;mso-position-horizontal:left;mso-position-horizontal-relative:char;mso-position-vertical:top;mso-position-vertical-relative:line">
             <v:imagedata r:id="rId9" o:title=""/>
           </v:shape>
         </w:pict>
@@ -19151,7 +19152,7 @@
       </w:pPr>
       <w:r>
         <w:pict w14:anchorId="3A526CB0">
-          <v:shape id="_x0000_i1030" type="#_x0000_t75" style="width:437.25pt;height:291.75pt;mso-position-horizontal:left;mso-position-horizontal-relative:char;mso-position-vertical:top;mso-position-vertical-relative:line">
+          <v:shape id="_x0000_i1030" type="#_x0000_t75" style="width:437pt;height:291.35pt;mso-position-horizontal:left;mso-position-horizontal-relative:char;mso-position-vertical:top;mso-position-vertical-relative:line">
             <v:imagedata r:id="rId10" o:title=""/>
           </v:shape>
         </w:pict>

</xml_diff>